<commit_message>
Mandato esclusivo: clausole comproprieta aggiornate e scheda Allegato B (21/07/2026)
Co-authored-by: Cursor <cursoragent@cursor.com>
</commit_message>
<xml_diff>
--- a/documenti/Modello-Mandato-Esclusivo-Vendita-Righetto-2026.docx
+++ b/documenti/Modello-Mandato-Esclusivo-Vendita-Righetto-2026.docx
@@ -312,7 +312,7 @@
           <w:b/>
           <w:sz w:val="22"/>
         </w:rPr>
-        <w:t xml:space="preserve">3.1 — Corresponsabilità pro quota. </w:t>
+        <w:t xml:space="preserve">3.1 — Corresponsabilità pro quota (11/11). </w:t>
       </w:r>
       <w:r>
         <w:rPr>
@@ -320,7 +320,7 @@
           <w:b w:val="0"/>
           <w:sz w:val="22"/>
         </w:rPr>
-        <w:t>Il compenso di mediazione è dovuto dai comproprietari pro quota, in misura corrispondente alla rispettiva quota di proprietà risultante da atti o da elenco allegato, salvo diverso accordo scritto tra le parti e l'AI.</w:t>
+        <w:t>Il compenso di mediazione è dovuto dai comproprietari pro quota, in misura corrispondente alla rispettiva quota di proprietà risultante da atti o da elenco allegato. Ciascun comproprietario è tenuto al pagamento per intero (11/11) della propria quota di provvigione, calcolata sulla provvigione complessiva di cui al presente articolo, salvo diverso accordo scritto tra le parti e l'AI.</w:t>
       </w:r>
     </w:p>
     <w:p>
@@ -366,7 +366,7 @@
           <w:b/>
           <w:sz w:val="22"/>
         </w:rPr>
-        <w:t xml:space="preserve">3.4 — Rifiuto al rogito e variazioni sostanziali (comproprietà). </w:t>
+        <w:t xml:space="preserve">3.4 — Accordo commerciale a prezzo di mandato e obbligo di cooperare. </w:t>
       </w:r>
       <w:r>
         <w:rPr>
@@ -374,7 +374,25 @@
           <w:b w:val="0"/>
           <w:sz w:val="22"/>
         </w:rPr>
-        <w:t>Qualora, accettata una proposta d'acquisto conforme al presente incarico e alle condizioni economiche in essa indicate, uno o più comproprietari si rifiutino, senza giustificato motivo, di procedere al rogito notarile, ovvero si rifiutino per variazioni sostanziali degli accordi già conclusi o per modifiche del prezzo pattuito nella proposta accettata, il comproprietario il cui comportamento abbia determinato il mancato perfezionamento dell'affare resterà tenuto, per intero, al pagamento del compenso di mediazione dovuto all'AI, ferma restando per il resto l'applicazione delle norme di legge in materia di solidarietà tra contraenti.</w:t>
+        <w:t>In presenza di pluralità di comproprietari, il perfezionamento dell'affare richiede il consenso di tutti. Quando, per effetto dell'attività dell'AI, sia stato definito un accordo commerciale con un potenziale acquirente — a titolo esemplificativo: proposta d'acquisto accettata, compromesso o contratto preliminare — per un prezzo pari o superiore a quello indicato al punto 2, i comproprietari non potranno opporsi al perfezionamento dell'affare senza giustificato motivo. Il comproprietario che, in tale ipotesi, si rifiuti di sottoscrivere gli atti necessari (rogito, preliminare o altro atto concordato) resterà tenuto, per intero, al pagamento del compenso di mediazione maturato ai sensi del presente articolo 3, nonché della penale di cui all'art. 7, pari al 100% (11/11) della provvigione pattuita sul prezzo di perfezionamento.</w:t>
+      </w:r>
+    </w:p>
+    <w:p>
+      <w:r>
+        <w:rPr>
+          <w:rFonts w:ascii="Times New Roman" w:hAnsi="Times New Roman"/>
+          <w:b/>
+          <w:sz w:val="22"/>
+        </w:rPr>
+        <w:t xml:space="preserve">Eccezione — proposta o accordo sotto prezzo dell'incarico. </w:t>
+      </w:r>
+      <w:r>
+        <w:rPr>
+          <w:rFonts w:ascii="Times New Roman" w:hAnsi="Times New Roman"/>
+          <w:b w:val="0"/>
+          <w:sz w:val="22"/>
+        </w:rPr>
+        <w:t>Se l'accordo commerciale o la proposta prevedono un prezzo inferiore a quello indicato nel presente incarico (a titolo esemplificativo: incarico a € 300.000,00 e proposta a importo inferiore), ciascun comproprietario potrà liberamente non prestare il consenso, ridiscutere la proposta con l'AI e con gli altri comproprietari, senza incorrere in penali né in obbligo di compenso ex art. 3.4.</w:t>
       </w:r>
     </w:p>
     <w:p>
@@ -384,7 +402,7 @@
           <w:b w:val="0"/>
           <w:sz w:val="22"/>
         </w:rPr>
-        <w:t>Per «giustificato motivo» si intende, a titolo esemplificativo, l'impossibilità oggettiva di trasferire per vincoli giurisdizionali non imputabili al Venditore, ovvero cause di forza maggiore debitamente documentate; non costituiscono giustificato motivo il mero ripensamento, la richiesta di prezzi superiori a quelli già accettati nella proposta vincolante, o la modifica unilaterale delle condizioni già pattuite.</w:t>
+        <w:t>Per «giustificato motivo» si intende, a titolo esemplificativo, l'impossibilità oggettiva di trasferire per vincoli giurisdizionali non imputabili al Venditore, ovvero cause di forza maggiore debitamente documentate, ovvero variazioni sostanziali delle condizioni dell'immobile emerse dopo l'accettazione e non imputabili al Venditore. Non costituiscono giustificato motivo il mero ripensamento di un singolo comproprietario quando la proposta è conforme all'incarico e al prezzo richiesto.</w:t>
       </w:r>
     </w:p>
     <w:p>
@@ -420,7 +438,7 @@
         <w:pStyle w:val="Heading2"/>
       </w:pPr>
       <w:r>
-        <w:t>5) Proposta d'acquisto</w:t>
+        <w:t>5) Proposta d'acquisto e contratto preliminare</w:t>
       </w:r>
     </w:p>
     <w:p>
@@ -431,6 +449,24 @@
           <w:sz w:val="22"/>
         </w:rPr>
         <w:t>L'AI è autorizzata a raccogliere proposte d'acquisto da aspiranti acquirenti, nonché a trattenere a titolo di deposito infruttifero assegni intestati alla parte venditrice, e a restituire i medesimi assegni in caso di mancata conclusione dell'affare per cause non imputabili all'acquirente proponente.</w:t>
+      </w:r>
+    </w:p>
+    <w:p>
+      <w:r>
+        <w:rPr>
+          <w:rFonts w:ascii="Times New Roman" w:hAnsi="Times New Roman"/>
+          <w:b/>
+          <w:sz w:val="22"/>
+        </w:rPr>
+        <w:t xml:space="preserve">Preliminare. </w:t>
+      </w:r>
+      <w:r>
+        <w:rPr>
+          <w:rFonts w:ascii="Times New Roman" w:hAnsi="Times New Roman"/>
+          <w:b w:val="0"/>
+          <w:sz w:val="22"/>
+        </w:rPr>
+        <w:t>L'AI è autorizzata ad assistere le parti nella stipula del contratto preliminare di compravendita. Il Venditore si impegna a rispettare gli obblighi assunti verso l'acquirente con tale atto e a cooperare per il perfezionamento del rogito definitivo nei termini concordati.</w:t>
       </w:r>
     </w:p>
     <w:p>
@@ -486,7 +522,7 @@
           <w:b w:val="0"/>
           <w:sz w:val="22"/>
         </w:rPr>
-        <w:t>A seguito di specifica trattativa individuale, viene pattuita una penale pari al 100% (cento per cento) della provvigione pattuita, a carico del Venditore e a favore dell'AI, nei seguenti casi:</w:t>
+        <w:t>A seguito di specifica trattativa individuale, viene pattuita una penale pari al 100% (cento per cento — 11/11) della provvigione pattuita ai sensi dell'art. 3, a carico del Venditore e a favore dell'AI, nei seguenti casi:</w:t>
       </w:r>
     </w:p>
     <w:p>
@@ -534,7 +570,7 @@
           <w:rFonts w:ascii="Times New Roman" w:hAnsi="Times New Roman"/>
           <w:sz w:val="22"/>
         </w:rPr>
-        <w:t>rifiuto al rogito o mancato perfezionamento dell'affare imputabile a uno o più comproprietari nei casi di cui all'art. 3, comma 3.4, con obbligo del comproprietario inadempiente di corrispondere per intero il compenso di mediazione maturato;</w:t>
+        <w:t>rifiuto al rogito o mancato perfezionamento dell'affare imputabile a uno o più comproprietari nei casi di cui all'art. 3, comma 3.4 — fermo restando il diritto di ogni comproprietario di non firmare ove la proposta sia per prezzo inferiore a quello indicato al punto 2 — con obbligo del comproprietario inadempiente di corrispondere per intero il compenso di mediazione maturato;</w:t>
       </w:r>
     </w:p>
     <w:p>
@@ -616,7 +652,7 @@
           <w:b/>
           <w:sz w:val="22"/>
         </w:rPr>
-        <w:t xml:space="preserve">Visite e accesso — giorno settimanale. </w:t>
+        <w:t xml:space="preserve">Visite e accesso — giorno settimanale e comproprietario residente. </w:t>
       </w:r>
       <w:r>
         <w:rPr>
@@ -624,7 +660,61 @@
           <w:b w:val="0"/>
           <w:sz w:val="22"/>
         </w:rPr>
-        <w:t>Dalla sottoscrizione del presente contratto, il Venditore riconosce all'AI la facoltà di organizzare sopralluoghi con potenziali acquirenti per almeno un giorno alla settimana, in fasce orarie concordate con ragionevole preavviso. Qualora uno o più comproprietari risiedano nell'immobile, essi conferiscono all'AI mandato operativo per la gestione degli accessi e si obbligano a concordare modalità e orari che consentano le visite. Il comproprietario residente che, senza giustificato motivo, renda impossibile o ostacoli in modo reiterato i sopralluoghi risponde di inadempimento contrattuale, con applicazione di quanto previsto agli artt. 7, lett. a), e 3, ove compatibile.</w:t>
+        <w:t>Dalla sottoscrizione del presente contratto, il Venditore riconosce all'AI la facoltà di organizzare sopralluoghi con potenziali acquirenti per almeno un giorno alla settimana, da concordare con l'AI all'avvio dell'incarico, in fasce orarie comunicate con ragionevole preavviso. Qualora uno o più comproprietari abbiano la residenza nell'immobile, essi garantiscono la disponibilità in tale giorno, salvo diverso accordo scritto con il comproprietario interessato. Qualora in tale giorno il comproprietario residente non possa garantire l'accesso per giusta causa (a titolo esemplificativo: impossibilità oggettiva, emergenza sanitaria, obblighi lavorativi non prevedibili), ne darà tempestiva comunicazione all'AI, che concorderà un nuovo appuntamento con l'acquirente interessato. Il comproprietario residente che, senza giustificato motivo, renda impossibile o ostacoli in modo reiterato i sopralluoghi risponde di inadempimento contrattuale, con applicazione di quanto previsto agli artt. 7, lett. a), e 3, ove compatibile.</w:t>
+      </w:r>
+    </w:p>
+    <w:p>
+      <w:r>
+        <w:rPr>
+          <w:rFonts w:ascii="Times New Roman" w:hAnsi="Times New Roman"/>
+          <w:b/>
+          <w:sz w:val="22"/>
+        </w:rPr>
+        <w:t xml:space="preserve">Documentazione catastale e urbanistica. </w:t>
+      </w:r>
+      <w:r>
+        <w:rPr>
+          <w:rFonts w:ascii="Times New Roman" w:hAnsi="Times New Roman"/>
+          <w:b w:val="0"/>
+          <w:sz w:val="22"/>
+        </w:rPr>
+        <w:t>Dalla sottoscrizione dell'accordo con l'acquirente (proposta accettata, preliminare o atto equivalente), il Venditore si obbliga a mettere a disposizione dell'AI e dell'acquirente, entro un termine concordato, tutta la documentazione catastale, urbanistica ed edilizia necessaria alla corretta definizione dell'affare, completa e in ordine.</w:t>
+      </w:r>
+    </w:p>
+    <w:p>
+      <w:r>
+        <w:rPr>
+          <w:rFonts w:ascii="Times New Roman" w:hAnsi="Times New Roman"/>
+          <w:b/>
+          <w:sz w:val="22"/>
+        </w:rPr>
+        <w:t xml:space="preserve">Consegna dell'immobile. </w:t>
+      </w:r>
+      <w:r>
+        <w:rPr>
+          <w:rFonts w:ascii="Times New Roman" w:hAnsi="Times New Roman"/>
+          <w:b w:val="0"/>
+          <w:sz w:val="22"/>
+        </w:rPr>
+        <w:t>Decorso il contratto preliminare, la consegna dell'immobile all'acquirente avverrà entro e non oltre sei (6) mesi dalla stipula del preliminare stesso, salvo diverso accordo scritto tra venditore, acquirente e AI.</w:t>
+      </w:r>
+    </w:p>
+    <w:p>
+      <w:r>
+        <w:rPr>
+          <w:rFonts w:ascii="Times New Roman" w:hAnsi="Times New Roman"/>
+          <w:b/>
+          <w:sz w:val="22"/>
+        </w:rPr>
+        <w:t xml:space="preserve">Inadempimento del comproprietario residente — spese e preliminare. </w:t>
+      </w:r>
+      <w:r>
+        <w:rPr>
+          <w:rFonts w:ascii="Times New Roman" w:hAnsi="Times New Roman"/>
+          <w:b w:val="0"/>
+          <w:sz w:val="22"/>
+        </w:rPr>
+        <w:t>Il comproprietario che abbia la residenza nell'immobile e, per motivi non previsti nel presente contratto né giustificati ai sensi dell'art. 3, non consenta la liberazione dell'immobile o l'accesso per visite e consegna nei termini concordati, resterà responsabile delle spese, dei danni e degli oneri consequenziali derivanti dagli accordi con futuri acquirenti e con l'AI. Ove sia stato stipulato un contratto preliminare e l'inadempimento sia imputabile al Venditore residente, quest'ultimo — nei limiti di legge e degli obblighi assunti nel preliminare — dovrà far fronte alle conseguenze previste dal contratto preliminare stesso, ivi compresa, ove applicabile, la restituzione della caparra confirmatoria in misura doppia all'acquirente, nonché al compenso di mediazione maturato e dovuto all'AI ai sensi dell'art. 3.</w:t>
       </w:r>
     </w:p>
     <w:p>
@@ -742,7 +832,7 @@
           <w:b w:val="0"/>
           <w:sz w:val="22"/>
         </w:rPr>
-        <w:t>A mente del Codice del Consumo (D.lgs. 206/2005), le parti dichiarano che le clausole del presente contratto sono state illustrate e oggetto di specifica trattativa individuale, in particolare quelle relative all'esclusiva, al compenso pro quota, al rifiuto al rogito di cui all'art. 3, alle visite settimanali, alla comunicazione di gravami e alle penali di cui all'art. 7, la cui approvazione è espressa in piena coscienza.</w:t>
+        <w:t>A mente del Codice del Consumo (D.lgs. 206/2005), le parti dichiarano che le clausole del presente contratto sono state illustrate e oggetto di specifica trattativa individuale, in particolare quelle relative all'esclusiva, al compenso pro quota (11/11), all'accordo commerciale e al rifiuto di firma di cui all'art. 3, al preliminare di cui all'art. 5, alle visite del comproprietario residente, alla documentazione catastale, alla consegna entro sei mesi, alla comunicazione di gravami e alle penali di cui all'art. 7, la cui approvazione è espressa in piena coscienza.</w:t>
       </w:r>
     </w:p>
     <w:p>
@@ -1159,7 +1249,7 @@
           <w:b w:val="0"/>
           <w:sz w:val="22"/>
         </w:rPr>
-        <w:t>Modello interno Righetto Immobiliare — revisione 17/07/2026. Documento di lavoro: verificare con consulenza legale/notarile prima dell'uso operativo. Deposito CCIAA Padova.</w:t>
+        <w:t>Modello interno Righetto Immobiliare — revisione 21/07/2026. Documento di lavoro: verificare con consulenza legale/notarile prima dell'uso operativo. Deposito CCIAA Padova.</w:t>
       </w:r>
     </w:p>
     <w:sectPr>

</xml_diff>